<commit_message>
Měření po cvičeních, cvičení navíc od rodiče, lekce na W a Q
Měření běželo jen po lekcích, takže se v průměru ztratilo, který druh
cvičení dělá potíže. Teď se měří po jednotlivých cvičeních a rodič může
podle toho zadat jedno navíc, které se dítěti ukáže před další lekcí.

Osnova dostala lekci na W a Q v angličtině, protože po svých lekcích by
se obě písmena v českém textu už neobjevila. Lekce 10 a 11 se páruje
symetricky, aby v nich šlo cvičit střídání rukou.

Slovník má 799 českých slov místo 539, hlavně kvůli prvním lekcím.

Co-Authored-By: Claude Opus 5 (1M context) <noreply@anthropic.com>
Claude-Session: https://claude.ai/code/session_015RkyKMB8xfH7XHuJGi57Tv
</commit_message>
<xml_diff>
--- a/docs/didactics.docx
+++ b/docs/didactics.docx
@@ -56,6 +56,14 @@
       </w:pPr>
       <w:r>
         <w:t xml:space="preserve">Czech sources agree on working outwards from the index fingers: F and J first, then D and K, S and L, A and Ů, then G and H. The top row follows, then the bottom row, then capitals, and the accented letters on the number row last.</w:t>
+      </w:r>
+    </w:p>
+    <w:p>
+      <w:pPr>
+        <w:pStyle w:val="Normal"/>
+      </w:pPr>
+      <w:r>
+        <w:t xml:space="preserve">Within a row the pairing is symmetric, the same finger on both hands: E and I are the middle fingers, R and U the index fingers, W and O the ring fingers, Q and P the little fingers. A pair like that can then be drilled by alternating hands, which is the second stage of the drill. The number row with the diacritics is the exception: ěščřžýáíé sit side by side and are paired as neighbours, because the layout allows no symmetry there.</w:t>
       </w:r>
     </w:p>
     <w:p>

</xml_diff>